<commit_message>
fd_family: lower min_reports 30 → 20
The notebook_cohort filter drops the ~7,000 trials from non-English /
no-feedback / no-DAT-before participants relative to the full pool used
by the source script (13,579 vs 20,557 trials). At min_reports=30 only
2 plant words clear the threshold (tree, trees), making Fig. 5b panel
(b) sparse. Lowering to 20 catches all the borderline plants
(forest:28, mushroom:28, flower:23) and increases overall strip-plot
density from 99 to 160 words while keeping a meaningful per-word
floor. The heatmap (panel a) is unaffected since it pools the whole
family.

Updates:
  - analysis/figures/fd_family.py:           default min_reports 30 → 20
  - paper/build_preview_pdf.py + build_word.js: body text and caption
  - paper/section_fd_family.md:              body text + Methods
  - paper/figures/fig5_fd_family*:           regenerated
  - outputs/fd_family_word_preferred_fd.csv: 99 → 160 rows
</commit_message>
<xml_diff>
--- a/paper/draft.docx
+++ b/paper/draft.docx
@@ -1693,7 +1693,7 @@
           <w:sz w:val="22"/>
           <w:szCs w:val="22"/>
         </w:rPr>
-        <w:t xml:space="preserve"> = +1.4 in both cases). Second, computing each family's rate-weighted preferred FD (a continuous summary of its tuning) orders the families on a smooth-to-rough axis from approximately 1.45 (persons, places, faces, objects) through 1.49 (animals) to 1.54 (mythical creatures, abstract textures, plants), recovering the expected progression from global, coherent forms at low complexity to fine, repeated structure at high complexity. The same gradient is visible at the percept level (Fig. 5b): the 99 individual words reported on at least 30 trials span a preferred-FD range of roughly 1.31 to 1.62, with the family means falling along the heatmap-derived ordering. The result formalises the qualitative content shift documented in Fig. 3 as a continuous mapping between stimulus complexity and the spatial scale of the meanings observers extract.</w:t>
+        <w:t xml:space="preserve"> = +1.4 in both cases). Second, computing each family's rate-weighted preferred FD (a continuous summary of its tuning) orders the families on a smooth-to-rough axis from approximately 1.45 (persons, places, faces, objects) through 1.49 (animals) to 1.54 (mythical creatures, abstract textures, plants), recovering the expected progression from global, coherent forms at low complexity to fine, repeated structure at high complexity. The same gradient is visible at the percept level (Fig. 5b): the 160 individual words reported on at least 20 trials span a preferred-FD range of roughly 1.29 to 1.62, with the family means falling along the heatmap-derived ordering. The result formalises the qualitative content shift documented in Fig. 3 as a continuous mapping between stimulus complexity and the spatial scale of the meanings observers extract.</w:t>
       </w:r>
     </w:p>
     <w:p>
@@ -1706,7 +1706,7 @@
           <wp:inline distT="0" distB="0" distL="0" distR="0">
             <wp:extent cx="4762500" cy="2609850"/>
             <wp:effectExtent t="0" r="0" b="0" l="0"/>
-            <wp:docPr id="1" name="fig5_fd_family.png" descr="(a) For each of eight hand-curated percept families (rows) and each FD level (columns), the relative report rate z-scored across FD within family; red = the family peaks at this FD. Rows ordered by each family's rate-weighted preferred FD, smooth (top) to rough (bottom). (b) Preferred FD per individual percept word with at least 30 reports (dots; mean FD of images where the word was reported), grouped by family with the family mean shown as a horizontal bar. Family coverage is 59% of all valid percept tokens." title="Fig. 5. Observers match fractal dimension to a percept family's spatial scale."/>
+            <wp:docPr id="1" name="fig5_fd_family.png" descr="(a) For each of eight hand-curated percept families (rows) and each FD level (columns), the relative report rate z-scored across FD within family; red = the family peaks at this FD. Rows ordered by each family's rate-weighted preferred FD, smooth (top) to rough (bottom). (b) Preferred FD per individual percept word with at least 20 reports (160 percepts; dots = mean FD of images where the word was reported), grouped by family with the family mean shown as a horizontal bar. Family coverage is 59% of all valid percept tokens." title="Fig. 5. Observers match fractal dimension to a percept family's spatial scale."/>
             <wp:cNvGraphicFramePr>
               <a:graphicFrameLocks xmlns:a="http://schemas.openxmlformats.org/drawingml/2006/main" noChangeAspect="1"/>
             </wp:cNvGraphicFramePr>
@@ -1761,7 +1761,7 @@
           <w:sz w:val="19"/>
           <w:szCs w:val="19"/>
         </w:rPr>
-        <w:t xml:space="preserve">(a) For each of eight hand-curated percept families (rows) and each FD level (columns), the relative report rate z-scored across FD within family; red = the family peaks at this FD. Rows ordered by each family's rate-weighted preferred FD, smooth (top) to rough (bottom). (b) Preferred FD per individual percept word with at least 30 reports (dots; mean FD of images where the word was reported), grouped by family with the family mean shown as a horizontal bar. Family coverage is 59% of all valid percept tokens.</w:t>
+        <w:t xml:space="preserve">(a) For each of eight hand-curated percept families (rows) and each FD level (columns), the relative report rate z-scored across FD within family; red = the family peaks at this FD. Rows ordered by each family's rate-weighted preferred FD, smooth (top) to rough (bottom). (b) Preferred FD per individual percept word with at least 20 reports (160 percepts; dots = mean FD of images where the word was reported), grouped by family with the family mean shown as a horizontal bar. Family coverage is 59% of all valid percept tokens.</w:t>
       </w:r>
     </w:p>
     <w:p>

</xml_diff>